<commit_message>
se descofiguro el documento
</commit_message>
<xml_diff>
--- a/tarea5.docx
+++ b/tarea5.docx
@@ -8,10 +8,10 @@
           <w:noProof/>
         </w:rPr>
         <w:drawing>
-          <wp:inline distT="0" distB="0" distL="0" distR="0" wp14:anchorId="6C0C994A" wp14:editId="34DEFAE0">
-            <wp:extent cx="5401310" cy="8815705"/>
+          <wp:inline distT="0" distB="0" distL="0" distR="0" wp14:anchorId="7B934E70" wp14:editId="2B7201BE">
+            <wp:extent cx="5400040" cy="8813632"/>
             <wp:effectExtent l="0" t="0" r="0" b="0"/>
-            <wp:docPr id="1" name="Imagen 1"/>
+            <wp:docPr id="2" name="Imagen 2"/>
             <wp:cNvGraphicFramePr>
               <a:graphicFrameLocks xmlns:a="http://schemas.openxmlformats.org/drawingml/2006/main" noChangeAspect="1"/>
             </wp:cNvGraphicFramePr>
@@ -40,7 +40,7 @@
                   <pic:spPr bwMode="auto">
                     <a:xfrm>
                       <a:off x="0" y="0"/>
-                      <a:ext cx="5401310" cy="8815705"/>
+                      <a:ext cx="5400040" cy="8813632"/>
                     </a:xfrm>
                     <a:prstGeom prst="rect">
                       <a:avLst/>
@@ -53,6 +53,12 @@
           </wp:inline>
         </w:drawing>
       </w:r>
+      <w:r>
+        <w:t xml:space="preserve">                                                                                                                                                                                                                                                                                                                                                                                                                                                                                                                                                                                                                           </w:t>
+      </w:r>
+      <w:r>
+        <w:t xml:space="preserve">                                                                                                                                                                                                                                                                                           </w:t>
+      </w:r>
     </w:p>
     <w:p>
       <w:pPr>
@@ -497,20 +503,14 @@
           <w:b/>
           <w:bCs/>
         </w:rPr>
+        <w:lastRenderedPageBreak/>
         <w:t>Modus Operandi:</w:t>
       </w:r>
       <w:r>
         <w:rPr>
           <w:rFonts w:ascii="Arial" w:hAnsi="Arial" w:cs="Arial"/>
         </w:rPr>
-        <w:t xml:space="preserve"> El atacante contactaba a la víctima mediante una llamada o mensaje, suplantando la identidad del soporte técnico de WhatsApp o de operadoras telefónicas locales (Entel, Tigo o Viva). Bajo pretextos como </w:t>
-      </w:r>
-      <w:r>
-        <w:rPr>
-          <w:rFonts w:ascii="Arial" w:hAnsi="Arial" w:cs="Arial"/>
-        </w:rPr>
-        <w:lastRenderedPageBreak/>
-        <w:t>"actualización de la red 4G" o "prevención de bloqueos", solicitaban a la víctima el código de verificación de 6 dígitos enviado por SMS.</w:t>
+        <w:t xml:space="preserve"> El atacante contactaba a la víctima mediante una llamada o mensaje, suplantando la identidad del soporte técnico de WhatsApp o de operadoras telefónicas locales (Entel, Tigo o Viva). Bajo pretextos como "actualización de la red 4G" o "prevención de bloqueos", solicitaban a la víctima el código de verificación de 6 dígitos enviado por SMS.</w:t>
       </w:r>
     </w:p>
     <w:p>
@@ -794,6 +794,7 @@
           <w:b/>
           <w:bCs/>
         </w:rPr>
+        <w:lastRenderedPageBreak/>
         <w:t>6. Estafa de Pagos QR "Simple" (Falsos Comprobantes)</w:t>
       </w:r>
     </w:p>
@@ -814,7 +815,6 @@
           <w:b/>
           <w:bCs/>
         </w:rPr>
-        <w:lastRenderedPageBreak/>
         <w:t>Modus Operandi Detallado:</w:t>
       </w:r>
       <w:r>
@@ -1194,7 +1194,6 @@
         <w:t xml:space="preserve"> El enlace dirige a una página web que es un calco exacto de la banca por internet real. Una vez que la víctima ingresa su usuario, contraseña y el código de seguridad (OTP) que llega por SMS, el atacante, que está operando al otro lado de la web falsa, ingresa simultáneamente al banco real. En cuestión de segundos, vacían las cuentas mediante transferencias a terceros ("mulas") o pagan servicios de terceros para lavar el dinero, dejando a la víctima sin posibilidad de revertir la operación.</w:t>
       </w:r>
     </w:p>
-    <w:p/>
     <w:p/>
     <w:p/>
     <w:sectPr>
@@ -2836,6 +2835,7 @@
   <w:style w:type="character" w:default="1" w:styleId="Fuentedeprrafopredeter">
     <w:name w:val="Default Paragraph Font"/>
     <w:uiPriority w:val="1"/>
+    <w:semiHidden/>
     <w:unhideWhenUsed/>
   </w:style>
   <w:style w:type="table" w:default="1" w:styleId="Tablanormal">

</xml_diff>